<commit_message>
feat(choice-a): integrate Taichung City Dispute Mediation Application (Article 59-1) to bypass 241-unit general assembly vote & add Article 534 special mediation authorization
</commit_message>
<xml_diff>
--- a/downloads/富宇大境A2獨立分割全權委任授權書.docx
+++ b/downloads/富宇大境A2獨立分割全權委任授權書.docx
@@ -133,7 +133,7 @@
           <w:color w:val="B8860B"/>
           <w:sz w:val="16"/>
         </w:rPr>
-        <w:t>第三條（主管機關行政程序協力權）：</w:t>
+        <w:t>第三條（爭議調處與主管機關報備權）：</w:t>
       </w:r>
       <w:r>
         <w:rPr>
@@ -141,7 +141,7 @@
           <w:color w:val="1A1D20"/>
           <w:sz w:val="16"/>
         </w:rPr>
-        <w:t>全權代表本區檢具法定卷宗與大會會議紀錄，向主管機關區公所申辦富宇大境獨立管委會備查，配合辦理報備證明與國稅局新統一編號申領全般公務程序。</w:t>
+        <w:t>全權代表本區依《公寓大廈管理條例》第 59 條之 1 向臺中市政府都市發展局（爭議事件調處委員會）申請爭議調處、出席調處會議、作成和解及簽署調處筆錄之特別代理權（符合民法第 534 條）；並向主管機關區公所申辦富宇大境獨立管委會備查與國稅局新統一編號申領。</w:t>
       </w:r>
     </w:p>
     <w:p>

</xml_diff>

<commit_message>
feat(strategy): transition Dajing to 'No Committee / Return to Independent Villas' route (0 management fee, refund 7,455 cash per household, zero admin burden)
</commit_message>
<xml_diff>
--- a/downloads/富宇大境A2獨立分割全權委任授權書.docx
+++ b/downloads/富宇大境A2獨立分割全權委任授權書.docx
@@ -111,7 +111,7 @@
           <w:color w:val="B8860B"/>
           <w:sz w:val="16"/>
         </w:rPr>
-        <w:t>第二條（清算協議草擬與協商代表權）：</w:t>
+        <w:t>第二條（專案款項均分返還協商權）：</w:t>
       </w:r>
       <w:r>
         <w:rPr>
@@ -119,7 +119,7 @@
           <w:color w:val="1A1D20"/>
           <w:sz w:val="16"/>
         </w:rPr>
-        <w:t>全權代表本區就新光銀行 A2 大境定存單（NT$ 220,231 元加計孳息）及交屋管理基金（NT$ 60,000 元，合計逾 28 萬元）與富宇大地管委會協商草擬《資產分割清算協議書》，俟大會通過後代表對接移交。</w:t>
+        <w:t>全權代表本區就新光銀行 A2 大境定存單（NT$ 220,231 元加計孳息）及交屋管理基金（NT$ 60,000 元，合計逾 28 萬元）與富宇大地管委會協商草擬移交清算協議，約定全額均分返還撥交本區 6 戶區權人（每戶約 NT$ 47,455 元）。</w:t>
       </w:r>
     </w:p>
     <w:p>
@@ -141,7 +141,7 @@
           <w:color w:val="1A1D20"/>
           <w:sz w:val="16"/>
         </w:rPr>
-        <w:t>全權代表本區依《公寓大廈管理條例》第 59 條之 1 向臺中市政府都市發展局（爭議事件調處委員會）申請爭議調處、出席調處會議、作成和解及簽署調處筆錄之特別代理權（符合民法第 534 條）；並向主管機關區公所申辦富宇大境獨立管委會備查與國稅局新統一編號申領。</w:t>
+        <w:t>全權代表本區依《公寓大廈管理條例》第 59 條之 1 向臺中市政府都市發展局（爭議事件調處委員會）申請爭議調處、出席調處會議、作成和解及簽署調處筆錄之特別代理權（符合民法第 534 條）；並向主管機關區公所申辦變更備查。</w:t>
       </w:r>
     </w:p>
     <w:p>

</xml_diff>